<commit_message>
Replace air_humidity feature with soil pH throughout
Swaps the third model feature from air_humidity to ph (soil pH) across
code, data, and all documentation:

- utils.py FEATURES + features_to_array; predict/estimate/recommend
  signatures, CLI args, and docstrings now use ph
- generate_data.py and generate_water_sunlight_data.py draw pH (5-8)
  and give it a small, clearly-labelled placeholder effect (pH is a
  chemistry property, not a strong driver of irrigation timing)
- Retrained both models and their saved .joblib files + plots
- CLAUDE.md, README.md, and the Word doc updated: feature table,
  hardware note (pH needs its own probe), examples, coefficients,
  metrics, and a new "why pH?" viva Q&A

New synthetic results: Model 1 accuracy/F1 ~0.94 (ph coef ~-0.56,
small as expected); Model 2 water R2 ~0.90, sunlight R2 ~0.40.

Co-Authored-By: Claude Opus 4.8 <noreply@anthropic.com>
Claude-Session: https://claude.ai/code/session_01T5nQdMAL2o1orn7K8b7F62
</commit_message>
<xml_diff>
--- a/docs/Smart_Irrigation_ML_Explanation.docx
+++ b/docs/Smart_Irrigation_ML_Explanation.docx
@@ -294,7 +294,7 @@
           <w:p>
             <w:r/>
             <w:r>
-              <w:t>air_humidity</w:t>
+              <w:t>ph</w:t>
             </w:r>
           </w:p>
         </w:tc>
@@ -305,7 +305,7 @@
           <w:p>
             <w:r/>
             <w:r>
-              <w:t>%</w:t>
+              <w:t>0–14</w:t>
             </w:r>
           </w:p>
         </w:tc>
@@ -316,7 +316,7 @@
           <w:p>
             <w:r/>
             <w:r>
-              <w:t>DHT11/DHT22 (same chip)</w:t>
+              <w:t>dedicated soil pH probe</w:t>
             </w:r>
           </w:p>
         </w:tc>
@@ -327,7 +327,7 @@
           <w:p>
             <w:r/>
             <w:r>
-              <w:t>Drier air → faster water loss → irrigate sooner</w:t>
+              <w:t>Soil chemistry; minor placeholder effect on watering timing</w:t>
             </w:r>
           </w:p>
         </w:tc>
@@ -340,7 +340,7 @@
           <w:i w:val="0"/>
           <w:sz w:val="22"/>
         </w:rPr>
-        <w:t>Rough importance order: soil_moisture ≫ temperature ≈ air_humidity. Temperature and humidity come from a single DHT11/DHT22 chip, so measuring both is very cheap for the hardware team.</w:t>
+        <w:t>Rough importance order: soil_moisture ≫ temperature ≫ ph. Temperature comes from the DHT11/DHT22; soil pH needs its own dedicated probe. Note: pH is a chemistry property (it affects nutrient uptake), not a strong physical driver of short-term irrigation timing — it is included because the hardware has a pH probe, and in the synthetic data it is given only a small placeholder effect. Real field data will reveal its true relationship.</w:t>
       </w:r>
     </w:p>
     <w:p>
@@ -648,16 +648,16 @@
           <w:color w:val="0B3D2E"/>
           <w:sz w:val="19"/>
         </w:rPr>
-        <w:t>python src/recommend.py 18 34 30</w:t>
+        <w:t>python src/recommend.py 18 34 6.5</w:t>
         <w:br/>
         <w:br/>
         <w:t>=== Irrigation recommendation ===</w:t>
         <w:br/>
         <w:t xml:space="preserve">  Irrigate?          : Yes  (P=0.999)</w:t>
         <w:br/>
-        <w:t xml:space="preserve">  Water to apply     : 6.67 L/m^2</w:t>
+        <w:t xml:space="preserve">  Water to apply     : 5.99 L/m^2</w:t>
         <w:br/>
-        <w:t xml:space="preserve">  Sunlight (advisory): 6.70 h</w:t>
+        <w:t xml:space="preserve">  Sunlight (advisory): 6.33 h</w:t>
       </w:r>
     </w:p>
     <w:p>
@@ -683,11 +683,11 @@
         </w:rPr>
         <w:t>from recommend import recommend</w:t>
         <w:br/>
-        <w:t>r = recommend(soil_moisture=18, temperature=34, air_humidity=30)</w:t>
+        <w:t>r = recommend(soil_moisture=18, temperature=34, ph=6.5)</w:t>
         <w:br/>
         <w:t># {"irrigate": "Yes", "irrigate_probability": 0.999,</w:t>
         <w:br/>
-        <w:t>#  "water_liters_per_m2": 6.67, "sunlight_hours": 6.70}</w:t>
+        <w:t>#  "water_liters_per_m2": 5.99, "sunlight_hours": 6.33}</w:t>
       </w:r>
     </w:p>
     <w:p>
@@ -918,7 +918,7 @@
           <w:p>
             <w:r/>
             <w:r>
-              <w:t>Accuracy ≈ 0.93, F1 ≈ 0.93</w:t>
+              <w:t>Accuracy ≈ 0.94, F1 ≈ 0.94</w:t>
             </w:r>
           </w:p>
         </w:tc>
@@ -953,7 +953,7 @@
           <w:p>
             <w:r/>
             <w:r>
-              <w:t>R² ≈ 0.88</w:t>
+              <w:t>R² ≈ 0.90</w:t>
             </w:r>
           </w:p>
         </w:tc>
@@ -988,7 +988,7 @@
           <w:p>
             <w:r/>
             <w:r>
-              <w:t>R² ≈ 0.48</w:t>
+              <w:t>R² ≈ 0.40</w:t>
             </w:r>
           </w:p>
         </w:tc>
@@ -1170,7 +1170,7 @@
           <w:p>
             <w:r/>
             <w:r>
-              <w:t>air_humidity</w:t>
+              <w:t>ph</w:t>
             </w:r>
           </w:p>
         </w:tc>
@@ -1181,7 +1181,7 @@
           <w:p>
             <w:r/>
             <w:r>
-              <w:t>negative</w:t>
+              <w:t>small negative</w:t>
             </w:r>
           </w:p>
         </w:tc>
@@ -1192,7 +1192,7 @@
           <w:p>
             <w:r/>
             <w:r>
-              <w:t>drier air → pushes toward Yes (sensible)</w:t>
+              <w:t>minor — pH isn’t a strong driver of watering timing</w:t>
             </w:r>
           </w:p>
         </w:tc>
@@ -1226,7 +1226,7 @@
           <w:i w:val="0"/>
           <w:sz w:val="22"/>
         </w:rPr>
-        <w:t>There is no real labelled field data yet, so both datasets are SYNTHETIC (computer-generated) but physically reasonable: dry soil + high temperature + low humidity leads to ‘irrigate’ and to higher water amounts. They are generated with a fixed random seed, so results are identical on every run.</w:t>
+        <w:t>There is no real labelled field data yet, so both datasets are SYNTHETIC (computer-generated) but physically reasonable: dry soil + high temperature leads to ‘irrigate’ and to higher water amounts, with soil pH given a small placeholder effect. They are generated with a fixed random seed, so results are identical on every run.</w:t>
       </w:r>
     </w:p>
     <w:p>
@@ -1389,7 +1389,7 @@
         <w:br/>
         <w:t>python src/train.py                    # train + evaluate + save</w:t>
         <w:br/>
-        <w:t>python src/predict.py 18 34 30         # -&gt; Yes</w:t>
+        <w:t>python src/predict.py 18 34 6.5        # -&gt; Yes</w:t>
         <w:br/>
         <w:br/>
         <w:t># Model 2 — water/sunlight estimate</w:t>
@@ -1398,12 +1398,12 @@
         <w:br/>
         <w:t>python src/train_regression.py</w:t>
         <w:br/>
-        <w:t>python src/estimate.py 18 34 30</w:t>
+        <w:t>python src/estimate.py 18 34 6.5</w:t>
         <w:br/>
         <w:br/>
         <w:t># Both models at once</w:t>
         <w:br/>
-        <w:t>python src/recommend.py 18 34 30</w:t>
+        <w:t>python src/recommend.py 18 34 6.5</w:t>
       </w:r>
     </w:p>
     <w:p>
@@ -1499,7 +1499,32 @@
         <w:t xml:space="preserve">A: </w:t>
       </w:r>
       <w:r>
-        <w:t>Sunlight need is mainly a crop property, not a function of soil moisture, temperature and humidity — so the sensors can’t explain it well. The model correctly reflects that there’s little real relationship.</w:t>
+        <w:t>Sunlight need is mainly a crop property, not a function of soil moisture, temperature and pH — so the sensors can’t explain it well. The model correctly reflects that there’s little real relationship.</w:t>
+      </w:r>
+    </w:p>
+    <w:p>
+      <w:r>
+        <w:rPr>
+          <w:b/>
+        </w:rPr>
+        <w:t xml:space="preserve">Q: </w:t>
+      </w:r>
+      <w:r>
+        <w:rPr>
+          <w:b/>
+        </w:rPr>
+        <w:t>Why is pH one of the inputs if it doesn’t drive watering timing?</w:t>
+      </w:r>
+    </w:p>
+    <w:p>
+      <w:r>
+        <w:rPr>
+          <w:b/>
+        </w:rPr>
+        <w:t xml:space="preserve">A: </w:t>
+      </w:r>
+      <w:r>
+        <w:t>Because the hardware has a pH probe, so the reading is available. pH is a chemistry property (nutrient uptake), not a strong driver of *when* to water, so in the synthetic data it has only a small placeholder effect — and the model’s small pH coefficient honestly reflects that. Real field data would reveal any genuine relationship.</w:t>
       </w:r>
     </w:p>
     <w:p>

</xml_diff>